<commit_message>
support for ti based system direct serial between dc and node: no plc
</commit_message>
<xml_diff>
--- a/Notes.docx
+++ b/Notes.docx
@@ -252,6 +252,607 @@
                 <w:szCs w:val="24"/>
               </w:rPr>
               <w:t>version 1.1.1, updated deploy.bat to publish to custom directory CentralMaster\publishcustdir. Added variables to deploy.bat file</w:t>
+            </w:r>
+          </w:p>
+        </w:tc>
+      </w:tr>
+      <w:tr>
+        <w:tc>
+          <w:tcPr>
+            <w:tcW w:w="805" w:type="dxa"/>
+          </w:tcPr>
+          <w:p>
+            <w:pPr>
+              <w:rPr>
+                <w:sz w:val="24"/>
+                <w:szCs w:val="24"/>
+              </w:rPr>
+            </w:pPr>
+          </w:p>
+        </w:tc>
+        <w:tc>
+          <w:tcPr>
+            <w:tcW w:w="1620" w:type="dxa"/>
+          </w:tcPr>
+          <w:p>
+            <w:pPr>
+              <w:rPr>
+                <w:sz w:val="24"/>
+                <w:szCs w:val="24"/>
+              </w:rPr>
+            </w:pPr>
+          </w:p>
+        </w:tc>
+        <w:tc>
+          <w:tcPr>
+            <w:tcW w:w="1620" w:type="dxa"/>
+          </w:tcPr>
+          <w:p>
+            <w:pPr>
+              <w:rPr>
+                <w:sz w:val="24"/>
+                <w:szCs w:val="24"/>
+              </w:rPr>
+            </w:pPr>
+          </w:p>
+        </w:tc>
+        <w:tc>
+          <w:tcPr>
+            <w:tcW w:w="1350" w:type="dxa"/>
+          </w:tcPr>
+          <w:p>
+            <w:pPr>
+              <w:rPr>
+                <w:sz w:val="24"/>
+                <w:szCs w:val="24"/>
+              </w:rPr>
+            </w:pPr>
+          </w:p>
+        </w:tc>
+        <w:tc>
+          <w:tcPr>
+            <w:tcW w:w="3955" w:type="dxa"/>
+          </w:tcPr>
+          <w:p>
+            <w:pPr>
+              <w:rPr>
+                <w:sz w:val="24"/>
+                <w:szCs w:val="24"/>
+              </w:rPr>
+            </w:pPr>
+          </w:p>
+        </w:tc>
+      </w:tr>
+      <w:tr>
+        <w:tc>
+          <w:tcPr>
+            <w:tcW w:w="805" w:type="dxa"/>
+          </w:tcPr>
+          <w:p>
+            <w:pPr>
+              <w:rPr>
+                <w:sz w:val="24"/>
+                <w:szCs w:val="24"/>
+              </w:rPr>
+            </w:pPr>
+          </w:p>
+        </w:tc>
+        <w:tc>
+          <w:tcPr>
+            <w:tcW w:w="1620" w:type="dxa"/>
+          </w:tcPr>
+          <w:p>
+            <w:pPr>
+              <w:rPr>
+                <w:sz w:val="24"/>
+                <w:szCs w:val="24"/>
+              </w:rPr>
+            </w:pPr>
+          </w:p>
+        </w:tc>
+        <w:tc>
+          <w:tcPr>
+            <w:tcW w:w="1620" w:type="dxa"/>
+          </w:tcPr>
+          <w:p>
+            <w:pPr>
+              <w:rPr>
+                <w:sz w:val="24"/>
+                <w:szCs w:val="24"/>
+              </w:rPr>
+            </w:pPr>
+          </w:p>
+        </w:tc>
+        <w:tc>
+          <w:tcPr>
+            <w:tcW w:w="1350" w:type="dxa"/>
+          </w:tcPr>
+          <w:p>
+            <w:pPr>
+              <w:rPr>
+                <w:sz w:val="24"/>
+                <w:szCs w:val="24"/>
+              </w:rPr>
+            </w:pPr>
+          </w:p>
+        </w:tc>
+        <w:tc>
+          <w:tcPr>
+            <w:tcW w:w="3955" w:type="dxa"/>
+          </w:tcPr>
+          <w:p>
+            <w:pPr>
+              <w:rPr>
+                <w:sz w:val="24"/>
+                <w:szCs w:val="24"/>
+              </w:rPr>
+            </w:pPr>
+          </w:p>
+        </w:tc>
+      </w:tr>
+      <w:tr>
+        <w:tc>
+          <w:tcPr>
+            <w:tcW w:w="805" w:type="dxa"/>
+          </w:tcPr>
+          <w:p>
+            <w:pPr>
+              <w:rPr>
+                <w:sz w:val="24"/>
+                <w:szCs w:val="24"/>
+              </w:rPr>
+            </w:pPr>
+          </w:p>
+        </w:tc>
+        <w:tc>
+          <w:tcPr>
+            <w:tcW w:w="1620" w:type="dxa"/>
+          </w:tcPr>
+          <w:p>
+            <w:pPr>
+              <w:rPr>
+                <w:sz w:val="24"/>
+                <w:szCs w:val="24"/>
+              </w:rPr>
+            </w:pPr>
+          </w:p>
+        </w:tc>
+        <w:tc>
+          <w:tcPr>
+            <w:tcW w:w="1620" w:type="dxa"/>
+          </w:tcPr>
+          <w:p>
+            <w:pPr>
+              <w:rPr>
+                <w:sz w:val="24"/>
+                <w:szCs w:val="24"/>
+              </w:rPr>
+            </w:pPr>
+          </w:p>
+        </w:tc>
+        <w:tc>
+          <w:tcPr>
+            <w:tcW w:w="1350" w:type="dxa"/>
+          </w:tcPr>
+          <w:p>
+            <w:pPr>
+              <w:rPr>
+                <w:sz w:val="24"/>
+                <w:szCs w:val="24"/>
+              </w:rPr>
+            </w:pPr>
+          </w:p>
+        </w:tc>
+        <w:tc>
+          <w:tcPr>
+            <w:tcW w:w="3955" w:type="dxa"/>
+          </w:tcPr>
+          <w:p>
+            <w:pPr>
+              <w:rPr>
+                <w:sz w:val="24"/>
+                <w:szCs w:val="24"/>
+              </w:rPr>
+            </w:pPr>
+          </w:p>
+        </w:tc>
+      </w:tr>
+      <w:tr>
+        <w:tc>
+          <w:tcPr>
+            <w:tcW w:w="805" w:type="dxa"/>
+          </w:tcPr>
+          <w:p>
+            <w:pPr>
+              <w:rPr>
+                <w:sz w:val="24"/>
+                <w:szCs w:val="24"/>
+              </w:rPr>
+            </w:pPr>
+          </w:p>
+        </w:tc>
+        <w:tc>
+          <w:tcPr>
+            <w:tcW w:w="1620" w:type="dxa"/>
+          </w:tcPr>
+          <w:p>
+            <w:pPr>
+              <w:rPr>
+                <w:sz w:val="24"/>
+                <w:szCs w:val="24"/>
+              </w:rPr>
+            </w:pPr>
+          </w:p>
+        </w:tc>
+        <w:tc>
+          <w:tcPr>
+            <w:tcW w:w="1620" w:type="dxa"/>
+          </w:tcPr>
+          <w:p>
+            <w:pPr>
+              <w:rPr>
+                <w:sz w:val="24"/>
+                <w:szCs w:val="24"/>
+              </w:rPr>
+            </w:pPr>
+          </w:p>
+        </w:tc>
+        <w:tc>
+          <w:tcPr>
+            <w:tcW w:w="1350" w:type="dxa"/>
+          </w:tcPr>
+          <w:p>
+            <w:pPr>
+              <w:rPr>
+                <w:sz w:val="24"/>
+                <w:szCs w:val="24"/>
+              </w:rPr>
+            </w:pPr>
+          </w:p>
+        </w:tc>
+        <w:tc>
+          <w:tcPr>
+            <w:tcW w:w="3955" w:type="dxa"/>
+          </w:tcPr>
+          <w:p>
+            <w:pPr>
+              <w:rPr>
+                <w:sz w:val="24"/>
+                <w:szCs w:val="24"/>
+              </w:rPr>
+            </w:pPr>
+          </w:p>
+        </w:tc>
+      </w:tr>
+      <w:tr>
+        <w:tc>
+          <w:tcPr>
+            <w:tcW w:w="805" w:type="dxa"/>
+          </w:tcPr>
+          <w:p>
+            <w:pPr>
+              <w:rPr>
+                <w:sz w:val="24"/>
+                <w:szCs w:val="24"/>
+              </w:rPr>
+            </w:pPr>
+          </w:p>
+        </w:tc>
+        <w:tc>
+          <w:tcPr>
+            <w:tcW w:w="1620" w:type="dxa"/>
+          </w:tcPr>
+          <w:p>
+            <w:pPr>
+              <w:rPr>
+                <w:sz w:val="24"/>
+                <w:szCs w:val="24"/>
+              </w:rPr>
+            </w:pPr>
+          </w:p>
+        </w:tc>
+        <w:tc>
+          <w:tcPr>
+            <w:tcW w:w="1620" w:type="dxa"/>
+          </w:tcPr>
+          <w:p>
+            <w:pPr>
+              <w:rPr>
+                <w:sz w:val="24"/>
+                <w:szCs w:val="24"/>
+              </w:rPr>
+            </w:pPr>
+          </w:p>
+        </w:tc>
+        <w:tc>
+          <w:tcPr>
+            <w:tcW w:w="1350" w:type="dxa"/>
+          </w:tcPr>
+          <w:p>
+            <w:pPr>
+              <w:rPr>
+                <w:sz w:val="24"/>
+                <w:szCs w:val="24"/>
+              </w:rPr>
+            </w:pPr>
+          </w:p>
+        </w:tc>
+        <w:tc>
+          <w:tcPr>
+            <w:tcW w:w="3955" w:type="dxa"/>
+          </w:tcPr>
+          <w:p>
+            <w:pPr>
+              <w:rPr>
+                <w:sz w:val="24"/>
+                <w:szCs w:val="24"/>
+              </w:rPr>
+            </w:pPr>
+          </w:p>
+        </w:tc>
+      </w:tr>
+    </w:tbl>
+    <w:p>
+      <w:pPr>
+        <w:rPr>
+          <w:sz w:val="24"/>
+          <w:szCs w:val="24"/>
+        </w:rPr>
+      </w:pPr>
+    </w:p>
+    <w:p>
+      <w:pPr>
+        <w:rPr>
+          <w:sz w:val="24"/>
+          <w:szCs w:val="24"/>
+        </w:rPr>
+      </w:pPr>
+      <w:r>
+        <w:rPr>
+          <w:sz w:val="24"/>
+          <w:szCs w:val="24"/>
+        </w:rPr>
+        <w:t>Branch:</w:t>
+      </w:r>
+    </w:p>
+    <w:tbl>
+      <w:tblPr>
+        <w:tblStyle w:val="TableGrid"/>
+        <w:tblW w:w="0" w:type="auto"/>
+        <w:tblLook w:val="04A0" w:firstRow="1" w:lastRow="0" w:firstColumn="1" w:lastColumn="0" w:noHBand="0" w:noVBand="1"/>
+      </w:tblPr>
+      <w:tblGrid>
+        <w:gridCol w:w="805"/>
+        <w:gridCol w:w="1620"/>
+        <w:gridCol w:w="1620"/>
+        <w:gridCol w:w="1350"/>
+        <w:gridCol w:w="3955"/>
+      </w:tblGrid>
+      <w:tr>
+        <w:tc>
+          <w:tcPr>
+            <w:tcW w:w="805" w:type="dxa"/>
+          </w:tcPr>
+          <w:p>
+            <w:pPr>
+              <w:jc w:val="center"/>
+              <w:rPr>
+                <w:b/>
+                <w:bCs/>
+                <w:sz w:val="24"/>
+                <w:szCs w:val="24"/>
+              </w:rPr>
+            </w:pPr>
+            <w:r>
+              <w:rPr>
+                <w:b/>
+                <w:bCs/>
+                <w:sz w:val="24"/>
+                <w:szCs w:val="24"/>
+              </w:rPr>
+              <w:t>S.No</w:t>
+            </w:r>
+          </w:p>
+        </w:tc>
+        <w:tc>
+          <w:tcPr>
+            <w:tcW w:w="1620" w:type="dxa"/>
+          </w:tcPr>
+          <w:p>
+            <w:pPr>
+              <w:jc w:val="center"/>
+              <w:rPr>
+                <w:b/>
+                <w:bCs/>
+                <w:sz w:val="24"/>
+                <w:szCs w:val="24"/>
+              </w:rPr>
+            </w:pPr>
+            <w:r>
+              <w:rPr>
+                <w:b/>
+                <w:bCs/>
+                <w:sz w:val="24"/>
+                <w:szCs w:val="24"/>
+              </w:rPr>
+              <w:t>Date</w:t>
+            </w:r>
+          </w:p>
+        </w:tc>
+        <w:tc>
+          <w:tcPr>
+            <w:tcW w:w="1620" w:type="dxa"/>
+          </w:tcPr>
+          <w:p>
+            <w:pPr>
+              <w:jc w:val="center"/>
+              <w:rPr>
+                <w:b/>
+                <w:bCs/>
+                <w:sz w:val="24"/>
+                <w:szCs w:val="24"/>
+              </w:rPr>
+            </w:pPr>
+            <w:r>
+              <w:rPr>
+                <w:b/>
+                <w:bCs/>
+                <w:sz w:val="24"/>
+                <w:szCs w:val="24"/>
+              </w:rPr>
+              <w:t>Author</w:t>
+            </w:r>
+          </w:p>
+        </w:tc>
+        <w:tc>
+          <w:tcPr>
+            <w:tcW w:w="1350" w:type="dxa"/>
+          </w:tcPr>
+          <w:p>
+            <w:pPr>
+              <w:jc w:val="center"/>
+              <w:rPr>
+                <w:b/>
+                <w:bCs/>
+                <w:sz w:val="24"/>
+                <w:szCs w:val="24"/>
+              </w:rPr>
+            </w:pPr>
+            <w:r>
+              <w:rPr>
+                <w:b/>
+                <w:bCs/>
+                <w:sz w:val="24"/>
+                <w:szCs w:val="24"/>
+              </w:rPr>
+              <w:t>Version</w:t>
+            </w:r>
+          </w:p>
+        </w:tc>
+        <w:tc>
+          <w:tcPr>
+            <w:tcW w:w="3955" w:type="dxa"/>
+          </w:tcPr>
+          <w:p>
+            <w:pPr>
+              <w:jc w:val="center"/>
+              <w:rPr>
+                <w:b/>
+                <w:bCs/>
+                <w:sz w:val="24"/>
+                <w:szCs w:val="24"/>
+              </w:rPr>
+            </w:pPr>
+            <w:r>
+              <w:rPr>
+                <w:b/>
+                <w:bCs/>
+                <w:sz w:val="24"/>
+                <w:szCs w:val="24"/>
+              </w:rPr>
+              <w:t>Notes</w:t>
+            </w:r>
+          </w:p>
+        </w:tc>
+      </w:tr>
+      <w:tr>
+        <w:tc>
+          <w:tcPr>
+            <w:tcW w:w="805" w:type="dxa"/>
+          </w:tcPr>
+          <w:p>
+            <w:pPr>
+              <w:rPr>
+                <w:sz w:val="24"/>
+                <w:szCs w:val="24"/>
+              </w:rPr>
+            </w:pPr>
+            <w:r>
+              <w:rPr>
+                <w:sz w:val="24"/>
+                <w:szCs w:val="24"/>
+              </w:rPr>
+              <w:t>1</w:t>
+            </w:r>
+          </w:p>
+        </w:tc>
+        <w:tc>
+          <w:tcPr>
+            <w:tcW w:w="1620" w:type="dxa"/>
+          </w:tcPr>
+          <w:p>
+            <w:pPr>
+              <w:rPr>
+                <w:sz w:val="24"/>
+                <w:szCs w:val="24"/>
+              </w:rPr>
+            </w:pPr>
+            <w:r>
+              <w:rPr>
+                <w:sz w:val="24"/>
+                <w:szCs w:val="24"/>
+              </w:rPr>
+              <w:t>8/3/2021</w:t>
+            </w:r>
+          </w:p>
+        </w:tc>
+        <w:tc>
+          <w:tcPr>
+            <w:tcW w:w="1620" w:type="dxa"/>
+          </w:tcPr>
+          <w:p>
+            <w:pPr>
+              <w:rPr>
+                <w:sz w:val="24"/>
+                <w:szCs w:val="24"/>
+              </w:rPr>
+            </w:pPr>
+            <w:r>
+              <w:rPr>
+                <w:sz w:val="24"/>
+                <w:szCs w:val="24"/>
+              </w:rPr>
+              <w:t>Viswanath</w:t>
+            </w:r>
+          </w:p>
+        </w:tc>
+        <w:tc>
+          <w:tcPr>
+            <w:tcW w:w="1350" w:type="dxa"/>
+          </w:tcPr>
+          <w:p>
+            <w:pPr>
+              <w:rPr>
+                <w:sz w:val="24"/>
+                <w:szCs w:val="24"/>
+              </w:rPr>
+            </w:pPr>
+            <w:r>
+              <w:rPr>
+                <w:sz w:val="24"/>
+                <w:szCs w:val="24"/>
+              </w:rPr>
+              <w:t>Direct-serial-no-plc</w:t>
+            </w:r>
+          </w:p>
+        </w:tc>
+        <w:tc>
+          <w:tcPr>
+            <w:tcW w:w="3955" w:type="dxa"/>
+          </w:tcPr>
+          <w:p>
+            <w:pPr>
+              <w:rPr>
+                <w:sz w:val="24"/>
+                <w:szCs w:val="24"/>
+              </w:rPr>
+            </w:pPr>
+            <w:r>
+              <w:rPr>
+                <w:sz w:val="24"/>
+                <w:szCs w:val="24"/>
+              </w:rPr>
+              <w:t>Direct to serial no plc for ti based system. HsotMessages and HostApp.cs handle the required messages from physical layer</w:t>
             </w:r>
           </w:p>
         </w:tc>
@@ -733,6 +1334,7 @@
     <w:lsdException w:name="HTML Sample" w:semiHidden="1" w:unhideWhenUsed="1"/>
     <w:lsdException w:name="HTML Typewriter" w:semiHidden="1" w:unhideWhenUsed="1"/>
     <w:lsdException w:name="HTML Variable" w:semiHidden="1" w:unhideWhenUsed="1"/>
+    <w:lsdException w:name="Normal Table" w:semiHidden="1" w:unhideWhenUsed="1"/>
     <w:lsdException w:name="annotation subject" w:semiHidden="1" w:unhideWhenUsed="1"/>
     <w:lsdException w:name="No List" w:semiHidden="1" w:unhideWhenUsed="1"/>
     <w:lsdException w:name="Outline List 1" w:semiHidden="1" w:unhideWhenUsed="1"/>
@@ -779,8 +1381,10 @@
     <w:lsdException w:name="Table Subtle 2" w:semiHidden="1" w:unhideWhenUsed="1"/>
     <w:lsdException w:name="Table Web 1" w:semiHidden="1" w:unhideWhenUsed="1"/>
     <w:lsdException w:name="Table Web 2" w:semiHidden="1" w:unhideWhenUsed="1"/>
+    <w:lsdException w:name="Table Web 3" w:semiHidden="1" w:unhideWhenUsed="1"/>
     <w:lsdException w:name="Balloon Text" w:semiHidden="1" w:unhideWhenUsed="1"/>
     <w:lsdException w:name="Table Grid" w:uiPriority="39"/>
+    <w:lsdException w:name="Table Theme" w:semiHidden="1" w:unhideWhenUsed="1"/>
     <w:lsdException w:name="Placeholder Text" w:semiHidden="1"/>
     <w:lsdException w:name="No Spacing" w:uiPriority="1" w:qFormat="1"/>
     <w:lsdException w:name="Light Shading" w:uiPriority="60"/>
@@ -1005,6 +1609,7 @@
   <w:style w:type="paragraph" w:default="1" w:styleId="Normal">
     <w:name w:val="Normal"/>
     <w:qFormat/>
+    <w:rsid w:val="00B87F2A"/>
   </w:style>
   <w:style w:type="character" w:default="1" w:styleId="DefaultParagraphFont">
     <w:name w:val="Default Paragraph Font"/>

</xml_diff>

<commit_message>
added resiliency to data computation by storing to file; every new http success overwrites the file
</commit_message>
<xml_diff>
--- a/Notes.docx
+++ b/Notes.docx
@@ -268,6 +268,13 @@
                 <w:szCs w:val="24"/>
               </w:rPr>
             </w:pPr>
+            <w:r>
+              <w:rPr>
+                <w:sz w:val="24"/>
+                <w:szCs w:val="24"/>
+              </w:rPr>
+              <w:t>2</w:t>
+            </w:r>
           </w:p>
         </w:tc>
         <w:tc>
@@ -281,6 +288,13 @@
                 <w:szCs w:val="24"/>
               </w:rPr>
             </w:pPr>
+            <w:r>
+              <w:rPr>
+                <w:sz w:val="24"/>
+                <w:szCs w:val="24"/>
+              </w:rPr>
+              <w:t>8/28/2021</w:t>
+            </w:r>
           </w:p>
         </w:tc>
         <w:tc>
@@ -294,6 +308,13 @@
                 <w:szCs w:val="24"/>
               </w:rPr>
             </w:pPr>
+            <w:r>
+              <w:rPr>
+                <w:sz w:val="24"/>
+                <w:szCs w:val="24"/>
+              </w:rPr>
+              <w:t>Viswanath</w:t>
+            </w:r>
           </w:p>
         </w:tc>
         <w:tc>
@@ -307,6 +328,13 @@
                 <w:szCs w:val="24"/>
               </w:rPr>
             </w:pPr>
+            <w:r>
+              <w:rPr>
+                <w:sz w:val="24"/>
+                <w:szCs w:val="24"/>
+              </w:rPr>
+              <w:t>1.1.3</w:t>
+            </w:r>
           </w:p>
         </w:tc>
         <w:tc>
@@ -320,6 +348,20 @@
                 <w:szCs w:val="24"/>
               </w:rPr>
             </w:pPr>
+            <w:r>
+              <w:rPr>
+                <w:sz w:val="24"/>
+                <w:szCs w:val="24"/>
+              </w:rPr>
+              <w:t xml:space="preserve">Added option “SupportedService” as “AzureTable”. This option will trigger using the connection string in json file to get the parameters from. Every successful response of parameters from Azure, the response is written to file. </w:t>
+            </w:r>
+            <w:r>
+              <w:rPr>
+                <w:sz w:val="24"/>
+                <w:szCs w:val="24"/>
+              </w:rPr>
+              <w:t>If on restart and connection not available, the app will read parameters from file and use that.</w:t>
+            </w:r>
           </w:p>
         </w:tc>
       </w:tr>
@@ -733,6 +775,7 @@
     <w:lsdException w:name="HTML Sample" w:semiHidden="1" w:unhideWhenUsed="1"/>
     <w:lsdException w:name="HTML Typewriter" w:semiHidden="1" w:unhideWhenUsed="1"/>
     <w:lsdException w:name="HTML Variable" w:semiHidden="1" w:unhideWhenUsed="1"/>
+    <w:lsdException w:name="Normal Table" w:semiHidden="1" w:unhideWhenUsed="1"/>
     <w:lsdException w:name="annotation subject" w:semiHidden="1" w:unhideWhenUsed="1"/>
     <w:lsdException w:name="No List" w:semiHidden="1" w:unhideWhenUsed="1"/>
     <w:lsdException w:name="Outline List 1" w:semiHidden="1" w:unhideWhenUsed="1"/>
@@ -779,8 +822,10 @@
     <w:lsdException w:name="Table Subtle 2" w:semiHidden="1" w:unhideWhenUsed="1"/>
     <w:lsdException w:name="Table Web 1" w:semiHidden="1" w:unhideWhenUsed="1"/>
     <w:lsdException w:name="Table Web 2" w:semiHidden="1" w:unhideWhenUsed="1"/>
+    <w:lsdException w:name="Table Web 3" w:semiHidden="1" w:unhideWhenUsed="1"/>
     <w:lsdException w:name="Balloon Text" w:semiHidden="1" w:unhideWhenUsed="1"/>
     <w:lsdException w:name="Table Grid" w:uiPriority="39"/>
+    <w:lsdException w:name="Table Theme" w:semiHidden="1" w:unhideWhenUsed="1"/>
     <w:lsdException w:name="Placeholder Text" w:semiHidden="1"/>
     <w:lsdException w:name="No Spacing" w:uiPriority="1" w:qFormat="1"/>
     <w:lsdException w:name="Light Shading" w:uiPriority="60"/>

</xml_diff>

<commit_message>
fixed error sending to dataservices layer; product offering; no need to add custom json for product
</commit_message>
<xml_diff>
--- a/Notes.docx
+++ b/Notes.docx
@@ -377,6 +377,13 @@
                 <w:szCs w:val="24"/>
               </w:rPr>
             </w:pPr>
+            <w:r>
+              <w:rPr>
+                <w:sz w:val="24"/>
+                <w:szCs w:val="24"/>
+              </w:rPr>
+              <w:t>3</w:t>
+            </w:r>
           </w:p>
         </w:tc>
         <w:tc>
@@ -390,6 +397,13 @@
                 <w:szCs w:val="24"/>
               </w:rPr>
             </w:pPr>
+            <w:r>
+              <w:rPr>
+                <w:sz w:val="24"/>
+                <w:szCs w:val="24"/>
+              </w:rPr>
+              <w:t>9/3/2021</w:t>
+            </w:r>
           </w:p>
         </w:tc>
         <w:tc>
@@ -403,6 +417,13 @@
                 <w:szCs w:val="24"/>
               </w:rPr>
             </w:pPr>
+            <w:r>
+              <w:rPr>
+                <w:sz w:val="24"/>
+                <w:szCs w:val="24"/>
+              </w:rPr>
+              <w:t>Viswanath</w:t>
+            </w:r>
           </w:p>
         </w:tc>
         <w:tc>
@@ -416,6 +437,13 @@
                 <w:szCs w:val="24"/>
               </w:rPr>
             </w:pPr>
+            <w:r>
+              <w:rPr>
+                <w:sz w:val="24"/>
+                <w:szCs w:val="24"/>
+              </w:rPr>
+              <w:t>1.1.4</w:t>
+            </w:r>
           </w:p>
         </w:tc>
         <w:tc>
@@ -429,6 +457,28 @@
                 <w:szCs w:val="24"/>
               </w:rPr>
             </w:pPr>
+            <w:r>
+              <w:rPr>
+                <w:sz w:val="24"/>
+                <w:szCs w:val="24"/>
+              </w:rPr>
+              <w:t>1) Fixed error “did not finish executing state machine in 1 sec” causing data not being sent to the DataServices layer, because of issues in transmission. Added BufferBlock with async methods to separate the computation and transfer of data to data services layer.</w:t>
+            </w:r>
+          </w:p>
+          <w:p>
+            <w:pPr>
+              <w:rPr>
+                <w:sz w:val="24"/>
+                <w:szCs w:val="24"/>
+              </w:rPr>
+            </w:pPr>
+            <w:r>
+              <w:rPr>
+                <w:sz w:val="24"/>
+                <w:szCs w:val="24"/>
+              </w:rPr>
+              <w:t>2) Added a product offering. In startup options an array of names includes available products. If the Node sends the “common name” as a product, it looks for “common name”.json file. This facilitates easier addition of product nodes without needing to create a json every time a new node is created. Custom solutions would require the complete “common name” + “_” + “serial number” + “.json” for it to work. By convention, all product names will start with “AP”</w:t>
+            </w:r>
           </w:p>
         </w:tc>
       </w:tr>

</xml_diff>

<commit_message>
exit app on 5088 err, all params single file, common parameter directory external to app, APIAQ support, dc pipe error restart
</commit_message>
<xml_diff>
--- a/Notes.docx
+++ b/Notes.docx
@@ -478,6 +478,212 @@
                 <w:szCs w:val="24"/>
               </w:rPr>
               <w:t>2) Added a product offering. In startup options an array of names includes available products. If the Node sends the “common name” as a product, it looks for “common name”.json file. This facilitates easier addition of product nodes without needing to create a json every time a new node is created. Custom solutions would require the complete “common name” + “_” + “serial number” + “.json” for it to work. By convention, all product names will start with “AP”</w:t>
+            </w:r>
+          </w:p>
+        </w:tc>
+      </w:tr>
+      <w:tr>
+        <w:tc>
+          <w:tcPr>
+            <w:tcW w:w="805" w:type="dxa"/>
+          </w:tcPr>
+          <w:p>
+            <w:pPr>
+              <w:rPr>
+                <w:sz w:val="24"/>
+                <w:szCs w:val="24"/>
+              </w:rPr>
+            </w:pPr>
+            <w:r>
+              <w:rPr>
+                <w:sz w:val="24"/>
+                <w:szCs w:val="24"/>
+              </w:rPr>
+              <w:t>4</w:t>
+            </w:r>
+          </w:p>
+        </w:tc>
+        <w:tc>
+          <w:tcPr>
+            <w:tcW w:w="1620" w:type="dxa"/>
+          </w:tcPr>
+          <w:p>
+            <w:pPr>
+              <w:rPr>
+                <w:sz w:val="24"/>
+                <w:szCs w:val="24"/>
+              </w:rPr>
+            </w:pPr>
+            <w:r>
+              <w:rPr>
+                <w:sz w:val="24"/>
+                <w:szCs w:val="24"/>
+              </w:rPr>
+              <w:t>10/10/2021</w:t>
+            </w:r>
+          </w:p>
+        </w:tc>
+        <w:tc>
+          <w:tcPr>
+            <w:tcW w:w="1620" w:type="dxa"/>
+          </w:tcPr>
+          <w:p>
+            <w:pPr>
+              <w:rPr>
+                <w:sz w:val="24"/>
+                <w:szCs w:val="24"/>
+              </w:rPr>
+            </w:pPr>
+            <w:r>
+              <w:rPr>
+                <w:sz w:val="24"/>
+                <w:szCs w:val="24"/>
+              </w:rPr>
+              <w:t>Viswaanth</w:t>
+            </w:r>
+          </w:p>
+        </w:tc>
+        <w:tc>
+          <w:tcPr>
+            <w:tcW w:w="1350" w:type="dxa"/>
+          </w:tcPr>
+          <w:p>
+            <w:pPr>
+              <w:rPr>
+                <w:sz w:val="24"/>
+                <w:szCs w:val="24"/>
+              </w:rPr>
+            </w:pPr>
+            <w:r>
+              <w:rPr>
+                <w:sz w:val="24"/>
+                <w:szCs w:val="24"/>
+              </w:rPr>
+              <w:t>1.1</w:t>
+            </w:r>
+            <w:r>
+              <w:rPr>
+                <w:sz w:val="24"/>
+                <w:szCs w:val="24"/>
+              </w:rPr>
+              <w:t>.</w:t>
+            </w:r>
+            <w:r>
+              <w:rPr>
+                <w:sz w:val="24"/>
+                <w:szCs w:val="24"/>
+              </w:rPr>
+              <w:t>5</w:t>
+            </w:r>
+          </w:p>
+        </w:tc>
+        <w:tc>
+          <w:tcPr>
+            <w:tcW w:w="3955" w:type="dxa"/>
+          </w:tcPr>
+          <w:p>
+            <w:pPr>
+              <w:rPr>
+                <w:sz w:val="24"/>
+                <w:szCs w:val="24"/>
+              </w:rPr>
+            </w:pPr>
+            <w:r>
+              <w:rPr>
+                <w:sz w:val="24"/>
+                <w:szCs w:val="24"/>
+              </w:rPr>
+              <w:t>1) exit app if communications error (eg 5088 or 50a2 etc) or no Data Confirmation received in 180 secs</w:t>
+            </w:r>
+          </w:p>
+          <w:p>
+            <w:pPr>
+              <w:rPr>
+                <w:sz w:val="24"/>
+                <w:szCs w:val="24"/>
+              </w:rPr>
+            </w:pPr>
+            <w:r>
+              <w:rPr>
+                <w:sz w:val="24"/>
+                <w:szCs w:val="24"/>
+              </w:rPr>
+              <w:lastRenderedPageBreak/>
+              <w:t>2) unify all parameters into a single json file, replace all parameters in .txt file to json file</w:t>
+            </w:r>
+          </w:p>
+          <w:p>
+            <w:pPr>
+              <w:rPr>
+                <w:sz w:val="24"/>
+                <w:szCs w:val="24"/>
+              </w:rPr>
+            </w:pPr>
+            <w:r>
+              <w:rPr>
+                <w:sz w:val="24"/>
+                <w:szCs w:val="24"/>
+              </w:rPr>
+              <w:t>3) All application parameters will by default go to directory /home/debain/config/centralmaster.</w:t>
+            </w:r>
+          </w:p>
+          <w:p>
+            <w:pPr>
+              <w:rPr>
+                <w:sz w:val="24"/>
+                <w:szCs w:val="24"/>
+              </w:rPr>
+            </w:pPr>
+            <w:r>
+              <w:rPr>
+                <w:sz w:val="24"/>
+                <w:szCs w:val="24"/>
+              </w:rPr>
+              <w:t>If a command line option is specified it is the parameter directory that the application should use.</w:t>
+            </w:r>
+            <w:r>
+              <w:rPr>
+                <w:sz w:val="24"/>
+                <w:szCs w:val="24"/>
+              </w:rPr>
+              <w:t xml:space="preserve"> This directory should contain in addition to the basic settings json files, the directories: “certs”, “Devices”, “NodesInfo” which are all used by different parts of the application.</w:t>
+            </w:r>
+          </w:p>
+          <w:p>
+            <w:pPr>
+              <w:rPr>
+                <w:sz w:val="24"/>
+                <w:szCs w:val="24"/>
+              </w:rPr>
+            </w:pPr>
+            <w:r>
+              <w:rPr>
+                <w:sz w:val="24"/>
+                <w:szCs w:val="24"/>
+              </w:rPr>
+              <w:t>4) Added support for a IAQ (or iaq) hw interface for IAQ product</w:t>
+            </w:r>
+            <w:r>
+              <w:rPr>
+                <w:sz w:val="24"/>
+                <w:szCs w:val="24"/>
+              </w:rPr>
+              <w:t xml:space="preserve"> (similar to powermeasurement architecture)</w:t>
+            </w:r>
+          </w:p>
+          <w:p>
+            <w:pPr>
+              <w:rPr>
+                <w:sz w:val="24"/>
+                <w:szCs w:val="24"/>
+              </w:rPr>
+            </w:pPr>
+            <w:r>
+              <w:rPr>
+                <w:sz w:val="24"/>
+                <w:szCs w:val="24"/>
+              </w:rPr>
+              <w:t>5) Once “Failed to send data …” occurs app does not recover and remains in the same state. Fixed it by calling StopServer() and StartServer() in DCPipeServer.cs</w:t>
             </w:r>
           </w:p>
         </w:tc>

</xml_diff>

<commit_message>
removed reboot on 0x5088 errors
</commit_message>
<xml_diff>
--- a/Notes.docx
+++ b/Notes.docx
@@ -700,6 +700,14 @@
                 <w:szCs w:val="24"/>
               </w:rPr>
             </w:pPr>
+            <w:r>
+              <w:rPr>
+                <w:sz w:val="24"/>
+                <w:szCs w:val="24"/>
+              </w:rPr>
+              <w:lastRenderedPageBreak/>
+              <w:t>5</w:t>
+            </w:r>
           </w:p>
         </w:tc>
         <w:tc>
@@ -713,6 +721,13 @@
                 <w:szCs w:val="24"/>
               </w:rPr>
             </w:pPr>
+            <w:r>
+              <w:rPr>
+                <w:sz w:val="24"/>
+                <w:szCs w:val="24"/>
+              </w:rPr>
+              <w:t>12/25/2021</w:t>
+            </w:r>
           </w:p>
         </w:tc>
         <w:tc>
@@ -726,6 +741,13 @@
                 <w:szCs w:val="24"/>
               </w:rPr>
             </w:pPr>
+            <w:r>
+              <w:rPr>
+                <w:sz w:val="24"/>
+                <w:szCs w:val="24"/>
+              </w:rPr>
+              <w:t>Viswanath</w:t>
+            </w:r>
           </w:p>
         </w:tc>
         <w:tc>
@@ -739,6 +761,13 @@
                 <w:szCs w:val="24"/>
               </w:rPr>
             </w:pPr>
+            <w:r>
+              <w:rPr>
+                <w:sz w:val="24"/>
+                <w:szCs w:val="24"/>
+              </w:rPr>
+              <w:t>1.1.6</w:t>
+            </w:r>
           </w:p>
         </w:tc>
         <w:tc>
@@ -752,6 +781,13 @@
                 <w:szCs w:val="24"/>
               </w:rPr>
             </w:pPr>
+            <w:r>
+              <w:rPr>
+                <w:sz w:val="24"/>
+                <w:szCs w:val="24"/>
+              </w:rPr>
+              <w:t xml:space="preserve">1) app freezes on some reboots with initial setup messages with no response, possible exiting app or error in PLC chip. Added a timeout, and in sequence (until all of the initialization is complete, the next step does not happen). </w:t>
+            </w:r>
           </w:p>
         </w:tc>
       </w:tr>
@@ -767,6 +803,13 @@
                 <w:szCs w:val="24"/>
               </w:rPr>
             </w:pPr>
+            <w:r>
+              <w:rPr>
+                <w:sz w:val="24"/>
+                <w:szCs w:val="24"/>
+              </w:rPr>
+              <w:t>6</w:t>
+            </w:r>
           </w:p>
         </w:tc>
         <w:tc>
@@ -780,6 +823,13 @@
                 <w:szCs w:val="24"/>
               </w:rPr>
             </w:pPr>
+            <w:r>
+              <w:rPr>
+                <w:sz w:val="24"/>
+                <w:szCs w:val="24"/>
+              </w:rPr>
+              <w:t>12/29/2021</w:t>
+            </w:r>
           </w:p>
         </w:tc>
         <w:tc>
@@ -793,6 +843,13 @@
                 <w:szCs w:val="24"/>
               </w:rPr>
             </w:pPr>
+            <w:r>
+              <w:rPr>
+                <w:sz w:val="24"/>
+                <w:szCs w:val="24"/>
+              </w:rPr>
+              <w:t>Viswanath</w:t>
+            </w:r>
           </w:p>
         </w:tc>
         <w:tc>
@@ -806,6 +863,13 @@
                 <w:szCs w:val="24"/>
               </w:rPr>
             </w:pPr>
+            <w:r>
+              <w:rPr>
+                <w:sz w:val="24"/>
+                <w:szCs w:val="24"/>
+              </w:rPr>
+              <w:t>1.1.7</w:t>
+            </w:r>
           </w:p>
         </w:tc>
         <w:tc>
@@ -819,6 +883,13 @@
                 <w:szCs w:val="24"/>
               </w:rPr>
             </w:pPr>
+            <w:r>
+              <w:rPr>
+                <w:sz w:val="24"/>
+                <w:szCs w:val="24"/>
+              </w:rPr>
+              <w:t>Removed the application exit on 0x5088 error</w:t>
+            </w:r>
           </w:p>
         </w:tc>
       </w:tr>

</xml_diff>

<commit_message>
RR loop sleep = time set minus time to get data from nodes
</commit_message>
<xml_diff>
--- a/Notes.docx
+++ b/Notes.docx
@@ -905,6 +905,13 @@
                 <w:szCs w:val="24"/>
               </w:rPr>
             </w:pPr>
+            <w:r>
+              <w:rPr>
+                <w:sz w:val="24"/>
+                <w:szCs w:val="24"/>
+              </w:rPr>
+              <w:t>7</w:t>
+            </w:r>
           </w:p>
         </w:tc>
         <w:tc>
@@ -918,6 +925,13 @@
                 <w:szCs w:val="24"/>
               </w:rPr>
             </w:pPr>
+            <w:r>
+              <w:rPr>
+                <w:sz w:val="24"/>
+                <w:szCs w:val="24"/>
+              </w:rPr>
+              <w:t>1/3/2022</w:t>
+            </w:r>
           </w:p>
         </w:tc>
         <w:tc>
@@ -931,6 +945,13 @@
                 <w:szCs w:val="24"/>
               </w:rPr>
             </w:pPr>
+            <w:r>
+              <w:rPr>
+                <w:sz w:val="24"/>
+                <w:szCs w:val="24"/>
+              </w:rPr>
+              <w:t>Viswanath</w:t>
+            </w:r>
           </w:p>
         </w:tc>
         <w:tc>
@@ -944,6 +965,13 @@
                 <w:szCs w:val="24"/>
               </w:rPr>
             </w:pPr>
+            <w:r>
+              <w:rPr>
+                <w:sz w:val="24"/>
+                <w:szCs w:val="24"/>
+              </w:rPr>
+              <w:t>1.1.8</w:t>
+            </w:r>
           </w:p>
         </w:tc>
         <w:tc>
@@ -957,6 +985,13 @@
                 <w:szCs w:val="24"/>
               </w:rPr>
             </w:pPr>
+            <w:r>
+              <w:rPr>
+                <w:sz w:val="24"/>
+                <w:szCs w:val="24"/>
+              </w:rPr>
+              <w:t>Time spent in rrloop and subtract from data interval. If time spent in rrloop is greater than data interval, then restart the loop.</w:t>
+            </w:r>
           </w:p>
         </w:tc>
       </w:tr>

</xml_diff>

<commit_message>
bugfix waiting for connection PLSDCConnection
</commit_message>
<xml_diff>
--- a/Notes.docx
+++ b/Notes.docx
@@ -991,6 +991,143 @@
                 <w:szCs w:val="24"/>
               </w:rPr>
               <w:t>Time spent in rrloop and subtract from data interval. If time spent in rrloop is greater than data interval, then restart the loop.</w:t>
+            </w:r>
+          </w:p>
+        </w:tc>
+      </w:tr>
+      <w:tr>
+        <w:tc>
+          <w:tcPr>
+            <w:tcW w:w="805" w:type="dxa"/>
+          </w:tcPr>
+          <w:p>
+            <w:pPr>
+              <w:rPr>
+                <w:sz w:val="24"/>
+                <w:szCs w:val="24"/>
+              </w:rPr>
+            </w:pPr>
+            <w:r>
+              <w:rPr>
+                <w:sz w:val="24"/>
+                <w:szCs w:val="24"/>
+              </w:rPr>
+              <w:t>8</w:t>
+            </w:r>
+          </w:p>
+        </w:tc>
+        <w:tc>
+          <w:tcPr>
+            <w:tcW w:w="1620" w:type="dxa"/>
+          </w:tcPr>
+          <w:p>
+            <w:pPr>
+              <w:rPr>
+                <w:sz w:val="24"/>
+                <w:szCs w:val="24"/>
+              </w:rPr>
+            </w:pPr>
+            <w:r>
+              <w:rPr>
+                <w:sz w:val="24"/>
+                <w:szCs w:val="24"/>
+              </w:rPr>
+              <w:t>1/8/2022</w:t>
+            </w:r>
+          </w:p>
+        </w:tc>
+        <w:tc>
+          <w:tcPr>
+            <w:tcW w:w="1620" w:type="dxa"/>
+          </w:tcPr>
+          <w:p>
+            <w:pPr>
+              <w:rPr>
+                <w:sz w:val="24"/>
+                <w:szCs w:val="24"/>
+              </w:rPr>
+            </w:pPr>
+            <w:r>
+              <w:rPr>
+                <w:sz w:val="24"/>
+                <w:szCs w:val="24"/>
+              </w:rPr>
+              <w:t>Viswanath</w:t>
+            </w:r>
+          </w:p>
+        </w:tc>
+        <w:tc>
+          <w:tcPr>
+            <w:tcW w:w="1350" w:type="dxa"/>
+          </w:tcPr>
+          <w:p>
+            <w:pPr>
+              <w:rPr>
+                <w:sz w:val="24"/>
+                <w:szCs w:val="24"/>
+              </w:rPr>
+            </w:pPr>
+            <w:r>
+              <w:rPr>
+                <w:sz w:val="24"/>
+                <w:szCs w:val="24"/>
+              </w:rPr>
+              <w:t>1.1.9</w:t>
+            </w:r>
+          </w:p>
+        </w:tc>
+        <w:tc>
+          <w:tcPr>
+            <w:tcW w:w="3955" w:type="dxa"/>
+          </w:tcPr>
+          <w:p>
+            <w:pPr>
+              <w:rPr>
+                <w:sz w:val="24"/>
+                <w:szCs w:val="24"/>
+              </w:rPr>
+            </w:pPr>
+            <w:r>
+              <w:rPr>
+                <w:sz w:val="24"/>
+                <w:szCs w:val="24"/>
+              </w:rPr>
+              <w:t>Bug</w:t>
+            </w:r>
+            <w:r>
+              <w:rPr>
+                <w:sz w:val="24"/>
+                <w:szCs w:val="24"/>
+              </w:rPr>
+              <w:t xml:space="preserve"> fix</w:t>
+            </w:r>
+            <w:r>
+              <w:rPr>
+                <w:sz w:val="24"/>
+                <w:szCs w:val="24"/>
+              </w:rPr>
+              <w:t>: Waiting for connection in PLSDCConnection, if send data is received app continuously exits.</w:t>
+            </w:r>
+            <w:r>
+              <w:rPr>
+                <w:sz w:val="24"/>
+                <w:szCs w:val="24"/>
+              </w:rPr>
+              <w:t xml:space="preserve"> If not connected, simply indicate that not connected and continue to wait for connections</w:t>
+            </w:r>
+            <w:r>
+              <w:rPr>
+                <w:sz w:val="24"/>
+                <w:szCs w:val="24"/>
+              </w:rPr>
+              <w:t>.</w:t>
+            </w:r>
+            <w:r>
+              <w:rPr>
+                <w:sz w:val="24"/>
+                <w:szCs w:val="24"/>
+              </w:rPr>
+              <w:t xml:space="preserve"> </w:t>
             </w:r>
           </w:p>
         </w:tc>

</xml_diff>

<commit_message>
data_names parsing bug for rs232 response code path
</commit_message>
<xml_diff>
--- a/Notes.docx
+++ b/Notes.docx
@@ -4,8 +4,13 @@
   <w:body>
     <w:p>
       <w:r>
-        <w:t>Notes file created in version 1.1.2 of CentralMaster</w:t>
+        <w:t xml:space="preserve">Notes file created in version 1.1.2 of </w:t>
       </w:r>
+      <w:proofErr w:type="spellStart"/>
+      <w:r>
+        <w:t>CentralMaster</w:t>
+      </w:r>
+      <w:proofErr w:type="spellEnd"/>
     </w:p>
     <w:tbl>
       <w:tblPr>
@@ -35,6 +40,7 @@
                 <w:szCs w:val="24"/>
               </w:rPr>
             </w:pPr>
+            <w:proofErr w:type="spellStart"/>
             <w:r>
               <w:rPr>
                 <w:b/>
@@ -44,6 +50,7 @@
               </w:rPr>
               <w:t>S.No</w:t>
             </w:r>
+            <w:proofErr w:type="spellEnd"/>
           </w:p>
         </w:tc>
         <w:tc>
@@ -251,7 +258,39 @@
                 <w:sz w:val="24"/>
                 <w:szCs w:val="24"/>
               </w:rPr>
-              <w:t>version 1.1.1, updated deploy.bat to publish to custom directory CentralMaster\publishcustdir. Added variables to deploy.bat file</w:t>
+              <w:t xml:space="preserve">version 1.1.1, updated deploy.bat to publish to custom directory </w:t>
+            </w:r>
+            <w:proofErr w:type="spellStart"/>
+            <w:r>
+              <w:rPr>
+                <w:sz w:val="24"/>
+                <w:szCs w:val="24"/>
+              </w:rPr>
+              <w:t>CentralMaster</w:t>
+            </w:r>
+            <w:proofErr w:type="spellEnd"/>
+            <w:r>
+              <w:rPr>
+                <w:sz w:val="24"/>
+                <w:szCs w:val="24"/>
+              </w:rPr>
+              <w:t>\</w:t>
+            </w:r>
+            <w:proofErr w:type="spellStart"/>
+            <w:r>
+              <w:rPr>
+                <w:sz w:val="24"/>
+                <w:szCs w:val="24"/>
+              </w:rPr>
+              <w:t>publishcustdir</w:t>
+            </w:r>
+            <w:proofErr w:type="spellEnd"/>
+            <w:r>
+              <w:rPr>
+                <w:sz w:val="24"/>
+                <w:szCs w:val="24"/>
+              </w:rPr>
+              <w:t>. Added variables to deploy.bat file</w:t>
             </w:r>
           </w:p>
         </w:tc>
@@ -353,7 +392,55 @@
                 <w:sz w:val="24"/>
                 <w:szCs w:val="24"/>
               </w:rPr>
-              <w:t xml:space="preserve">Added option “SupportedService” as “AzureTable”. This option will trigger using the connection string in json file to get the parameters from. Every successful response of parameters from Azure, the response is written to file. </w:t>
+              <w:t>Added option “</w:t>
+            </w:r>
+            <w:proofErr w:type="spellStart"/>
+            <w:r>
+              <w:rPr>
+                <w:sz w:val="24"/>
+                <w:szCs w:val="24"/>
+              </w:rPr>
+              <w:t>SupportedService</w:t>
+            </w:r>
+            <w:proofErr w:type="spellEnd"/>
+            <w:r>
+              <w:rPr>
+                <w:sz w:val="24"/>
+                <w:szCs w:val="24"/>
+              </w:rPr>
+              <w:t>” as “</w:t>
+            </w:r>
+            <w:proofErr w:type="spellStart"/>
+            <w:r>
+              <w:rPr>
+                <w:sz w:val="24"/>
+                <w:szCs w:val="24"/>
+              </w:rPr>
+              <w:t>AzureTable</w:t>
+            </w:r>
+            <w:proofErr w:type="spellEnd"/>
+            <w:r>
+              <w:rPr>
+                <w:sz w:val="24"/>
+                <w:szCs w:val="24"/>
+              </w:rPr>
+              <w:t xml:space="preserve">”. This option will trigger using the connection string in </w:t>
+            </w:r>
+            <w:proofErr w:type="spellStart"/>
+            <w:r>
+              <w:rPr>
+                <w:sz w:val="24"/>
+                <w:szCs w:val="24"/>
+              </w:rPr>
+              <w:t>json</w:t>
+            </w:r>
+            <w:proofErr w:type="spellEnd"/>
+            <w:r>
+              <w:rPr>
+                <w:sz w:val="24"/>
+                <w:szCs w:val="24"/>
+              </w:rPr>
+              <w:t xml:space="preserve"> file to get the parameters from. Every successful response of parameters from Azure, the response is written to file. </w:t>
             </w:r>
             <w:r>
               <w:rPr>
@@ -462,22 +549,102 @@
                 <w:sz w:val="24"/>
                 <w:szCs w:val="24"/>
               </w:rPr>
-              <w:t>1) Fixed error “did not finish executing state machine in 1 sec” causing data not being sent to the DataServices layer, because of issues in transmission. Added BufferBlock with async methods to separate the computation and transfer of data to data services layer.</w:t>
-            </w:r>
-          </w:p>
-          <w:p>
-            <w:pPr>
-              <w:rPr>
-                <w:sz w:val="24"/>
-                <w:szCs w:val="24"/>
-              </w:rPr>
-            </w:pPr>
-            <w:r>
-              <w:rPr>
-                <w:sz w:val="24"/>
-                <w:szCs w:val="24"/>
-              </w:rPr>
-              <w:t>2) Added a product offering. In startup options an array of names includes available products. If the Node sends the “common name” as a product, it looks for “common name”.json file. This facilitates easier addition of product nodes without needing to create a json every time a new node is created. Custom solutions would require the complete “common name” + “_” + “serial number” + “.json” for it to work. By convention, all product names will start with “AP”</w:t>
+              <w:t xml:space="preserve">1) Fixed error “did not finish executing state machine in 1 sec” causing data not being sent to the </w:t>
+            </w:r>
+            <w:proofErr w:type="spellStart"/>
+            <w:r>
+              <w:rPr>
+                <w:sz w:val="24"/>
+                <w:szCs w:val="24"/>
+              </w:rPr>
+              <w:t>DataServices</w:t>
+            </w:r>
+            <w:proofErr w:type="spellEnd"/>
+            <w:r>
+              <w:rPr>
+                <w:sz w:val="24"/>
+                <w:szCs w:val="24"/>
+              </w:rPr>
+              <w:t xml:space="preserve"> layer, because of issues in transmission. Added </w:t>
+            </w:r>
+            <w:proofErr w:type="spellStart"/>
+            <w:r>
+              <w:rPr>
+                <w:sz w:val="24"/>
+                <w:szCs w:val="24"/>
+              </w:rPr>
+              <w:t>BufferBlock</w:t>
+            </w:r>
+            <w:proofErr w:type="spellEnd"/>
+            <w:r>
+              <w:rPr>
+                <w:sz w:val="24"/>
+                <w:szCs w:val="24"/>
+              </w:rPr>
+              <w:t xml:space="preserve"> with async methods to separate the computation and transfer of data to data services layer.</w:t>
+            </w:r>
+          </w:p>
+          <w:p>
+            <w:pPr>
+              <w:rPr>
+                <w:sz w:val="24"/>
+                <w:szCs w:val="24"/>
+              </w:rPr>
+            </w:pPr>
+            <w:r>
+              <w:rPr>
+                <w:sz w:val="24"/>
+                <w:szCs w:val="24"/>
+              </w:rPr>
+              <w:t>2) Added a product offering. In startup options an array of names includes available products. If the Node sends the “common name” as a product, it looks for “common name”.</w:t>
+            </w:r>
+            <w:proofErr w:type="spellStart"/>
+            <w:r>
+              <w:rPr>
+                <w:sz w:val="24"/>
+                <w:szCs w:val="24"/>
+              </w:rPr>
+              <w:t>json</w:t>
+            </w:r>
+            <w:proofErr w:type="spellEnd"/>
+            <w:r>
+              <w:rPr>
+                <w:sz w:val="24"/>
+                <w:szCs w:val="24"/>
+              </w:rPr>
+              <w:t xml:space="preserve"> file. This facilitates easier addition of product nodes without needing to create a </w:t>
+            </w:r>
+            <w:proofErr w:type="spellStart"/>
+            <w:r>
+              <w:rPr>
+                <w:sz w:val="24"/>
+                <w:szCs w:val="24"/>
+              </w:rPr>
+              <w:t>json</w:t>
+            </w:r>
+            <w:proofErr w:type="spellEnd"/>
+            <w:r>
+              <w:rPr>
+                <w:sz w:val="24"/>
+                <w:szCs w:val="24"/>
+              </w:rPr>
+              <w:t xml:space="preserve"> every time a new node is created. Custom solutions would require the complete “common name” + “_” + “serial number” + “.</w:t>
+            </w:r>
+            <w:proofErr w:type="spellStart"/>
+            <w:r>
+              <w:rPr>
+                <w:sz w:val="24"/>
+                <w:szCs w:val="24"/>
+              </w:rPr>
+              <w:t>json</w:t>
+            </w:r>
+            <w:proofErr w:type="spellEnd"/>
+            <w:r>
+              <w:rPr>
+                <w:sz w:val="24"/>
+                <w:szCs w:val="24"/>
+              </w:rPr>
+              <w:t>” for it to work. By convention, all product names will start with “AP”</w:t>
             </w:r>
           </w:p>
         </w:tc>
@@ -534,6 +701,7 @@
                 <w:szCs w:val="24"/>
               </w:rPr>
             </w:pPr>
+            <w:proofErr w:type="spellStart"/>
             <w:r>
               <w:rPr>
                 <w:sz w:val="24"/>
@@ -541,6 +709,7 @@
               </w:rPr>
               <w:t>Viswaanth</w:t>
             </w:r>
+            <w:proofErr w:type="spellEnd"/>
           </w:p>
         </w:tc>
         <w:tc>
@@ -593,7 +762,39 @@
                 <w:sz w:val="24"/>
                 <w:szCs w:val="24"/>
               </w:rPr>
-              <w:t>1) exit app if communications error (eg 5088 or 50a2 etc) or no Data Confirmation received in 180 secs</w:t>
+              <w:t>1) exit app if communications error (</w:t>
+            </w:r>
+            <w:proofErr w:type="spellStart"/>
+            <w:r>
+              <w:rPr>
+                <w:sz w:val="24"/>
+                <w:szCs w:val="24"/>
+              </w:rPr>
+              <w:t>eg</w:t>
+            </w:r>
+            <w:proofErr w:type="spellEnd"/>
+            <w:r>
+              <w:rPr>
+                <w:sz w:val="24"/>
+                <w:szCs w:val="24"/>
+              </w:rPr>
+              <w:t xml:space="preserve"> 5088 or 50a2 </w:t>
+            </w:r>
+            <w:proofErr w:type="spellStart"/>
+            <w:r>
+              <w:rPr>
+                <w:sz w:val="24"/>
+                <w:szCs w:val="24"/>
+              </w:rPr>
+              <w:t>etc</w:t>
+            </w:r>
+            <w:proofErr w:type="spellEnd"/>
+            <w:r>
+              <w:rPr>
+                <w:sz w:val="24"/>
+                <w:szCs w:val="24"/>
+              </w:rPr>
+              <w:t>) or no Data Confirmation received in 180 secs</w:t>
             </w:r>
           </w:p>
           <w:p>
@@ -609,22 +810,86 @@
                 <w:szCs w:val="24"/>
               </w:rPr>
               <w:lastRenderedPageBreak/>
-              <w:t>2) unify all parameters into a single json file, replace all parameters in .txt file to json file</w:t>
-            </w:r>
-          </w:p>
-          <w:p>
-            <w:pPr>
-              <w:rPr>
-                <w:sz w:val="24"/>
-                <w:szCs w:val="24"/>
-              </w:rPr>
-            </w:pPr>
-            <w:r>
-              <w:rPr>
-                <w:sz w:val="24"/>
-                <w:szCs w:val="24"/>
-              </w:rPr>
-              <w:t>3) All application parameters will by default go to directory /home/debain/config/centralmaster.</w:t>
+              <w:t xml:space="preserve">2) unify all parameters into a single </w:t>
+            </w:r>
+            <w:proofErr w:type="spellStart"/>
+            <w:r>
+              <w:rPr>
+                <w:sz w:val="24"/>
+                <w:szCs w:val="24"/>
+              </w:rPr>
+              <w:t>json</w:t>
+            </w:r>
+            <w:proofErr w:type="spellEnd"/>
+            <w:r>
+              <w:rPr>
+                <w:sz w:val="24"/>
+                <w:szCs w:val="24"/>
+              </w:rPr>
+              <w:t xml:space="preserve"> file, replace all parameters in .txt file to </w:t>
+            </w:r>
+            <w:proofErr w:type="spellStart"/>
+            <w:r>
+              <w:rPr>
+                <w:sz w:val="24"/>
+                <w:szCs w:val="24"/>
+              </w:rPr>
+              <w:t>json</w:t>
+            </w:r>
+            <w:proofErr w:type="spellEnd"/>
+            <w:r>
+              <w:rPr>
+                <w:sz w:val="24"/>
+                <w:szCs w:val="24"/>
+              </w:rPr>
+              <w:t xml:space="preserve"> file</w:t>
+            </w:r>
+          </w:p>
+          <w:p>
+            <w:pPr>
+              <w:rPr>
+                <w:sz w:val="24"/>
+                <w:szCs w:val="24"/>
+              </w:rPr>
+            </w:pPr>
+            <w:r>
+              <w:rPr>
+                <w:sz w:val="24"/>
+                <w:szCs w:val="24"/>
+              </w:rPr>
+              <w:t>3) All application parameters will by default go to directory /home/</w:t>
+            </w:r>
+            <w:proofErr w:type="spellStart"/>
+            <w:r>
+              <w:rPr>
+                <w:sz w:val="24"/>
+                <w:szCs w:val="24"/>
+              </w:rPr>
+              <w:t>debain</w:t>
+            </w:r>
+            <w:proofErr w:type="spellEnd"/>
+            <w:r>
+              <w:rPr>
+                <w:sz w:val="24"/>
+                <w:szCs w:val="24"/>
+              </w:rPr>
+              <w:t>/config/</w:t>
+            </w:r>
+            <w:proofErr w:type="spellStart"/>
+            <w:r>
+              <w:rPr>
+                <w:sz w:val="24"/>
+                <w:szCs w:val="24"/>
+              </w:rPr>
+              <w:t>centralmaster</w:t>
+            </w:r>
+            <w:proofErr w:type="spellEnd"/>
+            <w:r>
+              <w:rPr>
+                <w:sz w:val="24"/>
+                <w:szCs w:val="24"/>
+              </w:rPr>
+              <w:t>.</w:t>
             </w:r>
           </w:p>
           <w:p>
@@ -646,45 +911,166 @@
                 <w:sz w:val="24"/>
                 <w:szCs w:val="24"/>
               </w:rPr>
-              <w:t xml:space="preserve"> This directory should contain in addition to the basic settings json files, the directories: “certs”, “Devices”, “NodesInfo” which are all used by different parts of the application.</w:t>
-            </w:r>
-          </w:p>
-          <w:p>
-            <w:pPr>
-              <w:rPr>
-                <w:sz w:val="24"/>
-                <w:szCs w:val="24"/>
-              </w:rPr>
-            </w:pPr>
-            <w:r>
-              <w:rPr>
-                <w:sz w:val="24"/>
-                <w:szCs w:val="24"/>
-              </w:rPr>
-              <w:t>4) Added support for a IAQ (or iaq) hw interface for IAQ product</w:t>
-            </w:r>
-            <w:r>
-              <w:rPr>
-                <w:sz w:val="24"/>
-                <w:szCs w:val="24"/>
-              </w:rPr>
-              <w:t xml:space="preserve"> (similar to powermeasurement architecture)</w:t>
-            </w:r>
-          </w:p>
-          <w:p>
-            <w:pPr>
-              <w:rPr>
-                <w:sz w:val="24"/>
-                <w:szCs w:val="24"/>
-              </w:rPr>
-            </w:pPr>
-            <w:r>
-              <w:rPr>
-                <w:sz w:val="24"/>
-                <w:szCs w:val="24"/>
-              </w:rPr>
-              <w:t>5) Once “Failed to send data …” occurs app does not recover and remains in the same state. Fixed it by calling StopServer() and StartServer() in DCPipeServer.cs</w:t>
-            </w:r>
+              <w:t xml:space="preserve"> This directory should contain in addition to the basic settings </w:t>
+            </w:r>
+            <w:proofErr w:type="spellStart"/>
+            <w:r>
+              <w:rPr>
+                <w:sz w:val="24"/>
+                <w:szCs w:val="24"/>
+              </w:rPr>
+              <w:t>json</w:t>
+            </w:r>
+            <w:proofErr w:type="spellEnd"/>
+            <w:r>
+              <w:rPr>
+                <w:sz w:val="24"/>
+                <w:szCs w:val="24"/>
+              </w:rPr>
+              <w:t xml:space="preserve"> files, the directories: “certs”, “Devices”, “</w:t>
+            </w:r>
+            <w:proofErr w:type="spellStart"/>
+            <w:r>
+              <w:rPr>
+                <w:sz w:val="24"/>
+                <w:szCs w:val="24"/>
+              </w:rPr>
+              <w:t>NodesInfo</w:t>
+            </w:r>
+            <w:proofErr w:type="spellEnd"/>
+            <w:r>
+              <w:rPr>
+                <w:sz w:val="24"/>
+                <w:szCs w:val="24"/>
+              </w:rPr>
+              <w:t>” which are all used by different parts of the application.</w:t>
+            </w:r>
+          </w:p>
+          <w:p>
+            <w:pPr>
+              <w:rPr>
+                <w:sz w:val="24"/>
+                <w:szCs w:val="24"/>
+              </w:rPr>
+            </w:pPr>
+            <w:r>
+              <w:rPr>
+                <w:sz w:val="24"/>
+                <w:szCs w:val="24"/>
+              </w:rPr>
+              <w:t xml:space="preserve">4) Added support for a IAQ (or </w:t>
+            </w:r>
+            <w:proofErr w:type="spellStart"/>
+            <w:r>
+              <w:rPr>
+                <w:sz w:val="24"/>
+                <w:szCs w:val="24"/>
+              </w:rPr>
+              <w:t>iaq</w:t>
+            </w:r>
+            <w:proofErr w:type="spellEnd"/>
+            <w:r>
+              <w:rPr>
+                <w:sz w:val="24"/>
+                <w:szCs w:val="24"/>
+              </w:rPr>
+              <w:t xml:space="preserve">) </w:t>
+            </w:r>
+            <w:proofErr w:type="spellStart"/>
+            <w:r>
+              <w:rPr>
+                <w:sz w:val="24"/>
+                <w:szCs w:val="24"/>
+              </w:rPr>
+              <w:t>hw</w:t>
+            </w:r>
+            <w:proofErr w:type="spellEnd"/>
+            <w:r>
+              <w:rPr>
+                <w:sz w:val="24"/>
+                <w:szCs w:val="24"/>
+              </w:rPr>
+              <w:t xml:space="preserve"> interface for IAQ product</w:t>
+            </w:r>
+            <w:r>
+              <w:rPr>
+                <w:sz w:val="24"/>
+                <w:szCs w:val="24"/>
+              </w:rPr>
+              <w:t xml:space="preserve"> (similar to </w:t>
+            </w:r>
+            <w:proofErr w:type="spellStart"/>
+            <w:r>
+              <w:rPr>
+                <w:sz w:val="24"/>
+                <w:szCs w:val="24"/>
+              </w:rPr>
+              <w:t>powermeasurement</w:t>
+            </w:r>
+            <w:proofErr w:type="spellEnd"/>
+            <w:r>
+              <w:rPr>
+                <w:sz w:val="24"/>
+                <w:szCs w:val="24"/>
+              </w:rPr>
+              <w:t xml:space="preserve"> architecture)</w:t>
+            </w:r>
+          </w:p>
+          <w:p>
+            <w:pPr>
+              <w:rPr>
+                <w:sz w:val="24"/>
+                <w:szCs w:val="24"/>
+              </w:rPr>
+            </w:pPr>
+            <w:r>
+              <w:rPr>
+                <w:sz w:val="24"/>
+                <w:szCs w:val="24"/>
+              </w:rPr>
+              <w:t xml:space="preserve">5) Once “Failed to send data …” occurs app does not recover and remains in the same state. Fixed it by calling </w:t>
+            </w:r>
+            <w:proofErr w:type="spellStart"/>
+            <w:r>
+              <w:rPr>
+                <w:sz w:val="24"/>
+                <w:szCs w:val="24"/>
+              </w:rPr>
+              <w:t>StopServer</w:t>
+            </w:r>
+            <w:proofErr w:type="spellEnd"/>
+            <w:r>
+              <w:rPr>
+                <w:sz w:val="24"/>
+                <w:szCs w:val="24"/>
+              </w:rPr>
+              <w:t xml:space="preserve">() and </w:t>
+            </w:r>
+            <w:proofErr w:type="spellStart"/>
+            <w:r>
+              <w:rPr>
+                <w:sz w:val="24"/>
+                <w:szCs w:val="24"/>
+              </w:rPr>
+              <w:t>StartServer</w:t>
+            </w:r>
+            <w:proofErr w:type="spellEnd"/>
+            <w:r>
+              <w:rPr>
+                <w:sz w:val="24"/>
+                <w:szCs w:val="24"/>
+              </w:rPr>
+              <w:t xml:space="preserve">() in </w:t>
+            </w:r>
+            <w:proofErr w:type="spellStart"/>
+            <w:r>
+              <w:rPr>
+                <w:sz w:val="24"/>
+                <w:szCs w:val="24"/>
+              </w:rPr>
+              <w:t>DCPipeServer.cs</w:t>
+            </w:r>
+            <w:proofErr w:type="spellEnd"/>
           </w:p>
         </w:tc>
       </w:tr>
@@ -990,7 +1376,39 @@
                 <w:sz w:val="24"/>
                 <w:szCs w:val="24"/>
               </w:rPr>
-              <w:t>Time spent in rrloop and subtract from data interval. If time spent in rrloop is greater than data interval, then restart the loop.</w:t>
+              <w:t xml:space="preserve">Time spent in </w:t>
+            </w:r>
+            <w:proofErr w:type="spellStart"/>
+            <w:r>
+              <w:rPr>
+                <w:sz w:val="24"/>
+                <w:szCs w:val="24"/>
+              </w:rPr>
+              <w:t>rrloop</w:t>
+            </w:r>
+            <w:proofErr w:type="spellEnd"/>
+            <w:r>
+              <w:rPr>
+                <w:sz w:val="24"/>
+                <w:szCs w:val="24"/>
+              </w:rPr>
+              <w:t xml:space="preserve"> and subtract from data interval. If time spent in </w:t>
+            </w:r>
+            <w:proofErr w:type="spellStart"/>
+            <w:r>
+              <w:rPr>
+                <w:sz w:val="24"/>
+                <w:szCs w:val="24"/>
+              </w:rPr>
+              <w:t>rrloop</w:t>
+            </w:r>
+            <w:proofErr w:type="spellEnd"/>
+            <w:r>
+              <w:rPr>
+                <w:sz w:val="24"/>
+                <w:szCs w:val="24"/>
+              </w:rPr>
+              <w:t xml:space="preserve"> is greater than data interval, then restart the loop.</w:t>
             </w:r>
           </w:p>
         </w:tc>
@@ -1106,7 +1524,23 @@
                 <w:sz w:val="24"/>
                 <w:szCs w:val="24"/>
               </w:rPr>
-              <w:t>: Waiting for connection in PLSDCConnection, if send data is received app continuously exits.</w:t>
+              <w:t xml:space="preserve">: Waiting for connection in </w:t>
+            </w:r>
+            <w:proofErr w:type="spellStart"/>
+            <w:r>
+              <w:rPr>
+                <w:sz w:val="24"/>
+                <w:szCs w:val="24"/>
+              </w:rPr>
+              <w:t>PLSDCConnection</w:t>
+            </w:r>
+            <w:proofErr w:type="spellEnd"/>
+            <w:r>
+              <w:rPr>
+                <w:sz w:val="24"/>
+                <w:szCs w:val="24"/>
+              </w:rPr>
+              <w:t>, if send data is received app continuously exits.</w:t>
             </w:r>
             <w:r>
               <w:rPr>
@@ -1128,6 +1562,148 @@
                 <w:szCs w:val="24"/>
               </w:rPr>
               <w:t xml:space="preserve"> </w:t>
+            </w:r>
+          </w:p>
+        </w:tc>
+      </w:tr>
+      <w:tr>
+        <w:tc>
+          <w:tcPr>
+            <w:tcW w:w="805" w:type="dxa"/>
+          </w:tcPr>
+          <w:p>
+            <w:pPr>
+              <w:rPr>
+                <w:sz w:val="24"/>
+                <w:szCs w:val="24"/>
+              </w:rPr>
+            </w:pPr>
+            <w:r>
+              <w:rPr>
+                <w:sz w:val="24"/>
+                <w:szCs w:val="24"/>
+              </w:rPr>
+              <w:t>9</w:t>
+            </w:r>
+          </w:p>
+        </w:tc>
+        <w:tc>
+          <w:tcPr>
+            <w:tcW w:w="1620" w:type="dxa"/>
+          </w:tcPr>
+          <w:p>
+            <w:pPr>
+              <w:rPr>
+                <w:sz w:val="24"/>
+                <w:szCs w:val="24"/>
+              </w:rPr>
+            </w:pPr>
+            <w:r>
+              <w:rPr>
+                <w:sz w:val="24"/>
+                <w:szCs w:val="24"/>
+              </w:rPr>
+              <w:t>3/17/2022</w:t>
+            </w:r>
+          </w:p>
+        </w:tc>
+        <w:tc>
+          <w:tcPr>
+            <w:tcW w:w="1620" w:type="dxa"/>
+          </w:tcPr>
+          <w:p>
+            <w:pPr>
+              <w:rPr>
+                <w:sz w:val="24"/>
+                <w:szCs w:val="24"/>
+              </w:rPr>
+            </w:pPr>
+            <w:r>
+              <w:rPr>
+                <w:sz w:val="24"/>
+                <w:szCs w:val="24"/>
+              </w:rPr>
+              <w:t>Viswanath</w:t>
+            </w:r>
+          </w:p>
+        </w:tc>
+        <w:tc>
+          <w:tcPr>
+            <w:tcW w:w="1350" w:type="dxa"/>
+          </w:tcPr>
+          <w:p>
+            <w:pPr>
+              <w:rPr>
+                <w:sz w:val="24"/>
+                <w:szCs w:val="24"/>
+              </w:rPr>
+            </w:pPr>
+            <w:r>
+              <w:rPr>
+                <w:sz w:val="24"/>
+                <w:szCs w:val="24"/>
+              </w:rPr>
+              <w:t>1.1.10</w:t>
+            </w:r>
+          </w:p>
+        </w:tc>
+        <w:tc>
+          <w:tcPr>
+            <w:tcW w:w="3955" w:type="dxa"/>
+          </w:tcPr>
+          <w:p>
+            <w:pPr>
+              <w:rPr>
+                <w:sz w:val="24"/>
+                <w:szCs w:val="24"/>
+              </w:rPr>
+            </w:pPr>
+            <w:r>
+              <w:rPr>
+                <w:sz w:val="24"/>
+                <w:szCs w:val="24"/>
+              </w:rPr>
+              <w:t xml:space="preserve">Bugfix : error parsing </w:t>
+            </w:r>
+            <w:proofErr w:type="spellStart"/>
+            <w:r>
+              <w:rPr>
+                <w:sz w:val="24"/>
+                <w:szCs w:val="24"/>
+              </w:rPr>
+              <w:t>data_names</w:t>
+            </w:r>
+            <w:proofErr w:type="spellEnd"/>
+            <w:r>
+              <w:rPr>
+                <w:sz w:val="24"/>
+                <w:szCs w:val="24"/>
+              </w:rPr>
+              <w:t xml:space="preserve"> in Node </w:t>
+            </w:r>
+            <w:proofErr w:type="spellStart"/>
+            <w:r>
+              <w:rPr>
+                <w:sz w:val="24"/>
+                <w:szCs w:val="24"/>
+              </w:rPr>
+              <w:t>json</w:t>
+            </w:r>
+            <w:proofErr w:type="spellEnd"/>
+            <w:r>
+              <w:rPr>
+                <w:sz w:val="24"/>
+                <w:szCs w:val="24"/>
+              </w:rPr>
+              <w:t xml:space="preserve"> file “key already added”. </w:t>
+            </w:r>
+            <w:r>
+              <w:rPr>
+                <w:sz w:val="24"/>
+                <w:szCs w:val="24"/>
+              </w:rPr>
+              <w:lastRenderedPageBreak/>
+              <w:t>All protocols responses combined in code for RS232, RS485, I2C. Naming prefix of “I2C00_” convention to be included only for I2C.</w:t>
             </w:r>
           </w:p>
         </w:tc>

</xml_diff>